<commit_message>
Update README port references to 8513
</commit_message>
<xml_diff>
--- a/README.docx
+++ b/README.docx
@@ -123,7 +123,7 @@
         <w:rPr>
           <w:rStyle w:val="VerbatimChar"/>
         </w:rPr>
-        <w:t xml:space="preserve">│                  (port 8503)                             │</w:t>
+        <w:t xml:space="preserve">│                  (port 8513)                             │</w:t>
       </w:r>
       <w:r>
         <w:br/>
@@ -2927,7 +2927,7 @@
         <w:rPr>
           <w:rStyle w:val="VerbatimChar"/>
         </w:rPr>
-        <w:t xml:space="preserve">├── app.py                          # Flask entry point (port 8503)</w:t>
+        <w:t xml:space="preserve">├── app.py                          # Flask entry point (port 8513)</w:t>
       </w:r>
       <w:r>
         <w:br/>
@@ -6364,7 +6364,7 @@
         <w:rPr>
           <w:rStyle w:val="CommentTok"/>
         </w:rPr>
-        <w:t xml:space="preserve"># Runs on http://localhost:8503</w:t>
+        <w:t xml:space="preserve"># Runs on http://localhost:8513</w:t>
       </w:r>
     </w:p>
     <w:p>
@@ -6391,7 +6391,7 @@
         <w:rPr>
           <w:rStyle w:val="NormalTok"/>
         </w:rPr>
-        <w:t xml:space="preserve"> wsgi:app -b 0.0.0.0:8503</w:t>
+        <w:t xml:space="preserve"> wsgi:app -b 0.0.0.0:8513</w:t>
       </w:r>
     </w:p>
     <w:p>
@@ -6612,7 +6612,7 @@
         <w:pStyle w:val="Compact"/>
       </w:pPr>
       <w:r>
-        <w:t xml:space="preserve">Flask app starts on port 8503 — all pages render with Tailwind</w:t>
+        <w:t xml:space="preserve">Flask app starts on port 8513 — all pages render with Tailwind</w:t>
       </w:r>
     </w:p>
     <w:p>

</xml_diff>